<commit_message>
Add monthly breakdown to simple SMS volume estimate
Co-Authored-By: Claude Opus 5.5 <noreply@anthropic.com>
Claude-Session: https://claude.ai/code/session_01K24oH4hyvmPrpfSAb7rQ54
</commit_message>
<xml_diff>
--- a/docs/sms-volume-estimate-simple.docx
+++ b/docs/sms-volume-estimate-simple.docx
@@ -271,7 +271,7 @@
     <w:p>
       <w:pPr/>
       <w:r>
-        <w:t xml:space="preserve">The live campaigns with SMS sent 76,593 messages in October (Oct 1 to 29), about 80k a month.</w:t>
+        <w:t xml:space="preserve">The live campaigns with SMS sent 76,600 messages in October (Oct 1 to 29), about 80k a month.</w:t>
       </w:r>
     </w:p>
     <w:tbl>
@@ -346,7 +346,7 @@
           <w:p>
             <w:pPr/>
             <w:r>
-              <w:t xml:space="preserve">72,261</w:t>
+              <w:t xml:space="preserve">72,268</w:t>
             </w:r>
           </w:p>
         </w:tc>
@@ -597,7 +597,7 @@
               <w:rPr>
                 <w:b/>
               </w:rPr>
-              <w:t xml:space="preserve">76,593</w:t>
+              <w:t xml:space="preserve">76,600</w:t>
             </w:r>
           </w:p>
         </w:tc>
@@ -617,6 +617,868 @@
         </w:tc>
       </w:tr>
     </w:tbl>
+    <w:p>
+      <w:pPr>
+        <w:pStyle w:val="Heading3"/>
+      </w:pPr>
+      <w:r>
+        <w:t xml:space="preserve">Monthly breakdown, last 12 months</w:t>
+      </w:r>
+    </w:p>
+    <w:p>
+      <w:pPr/>
+      <w:r>
+        <w:t xml:space="preserve">Abandoned Checkout Campaign v3 started on Jul 20, 2026, so its 204,209 total in Customer.io covers only Jul–Oct.</w:t>
+      </w:r>
+    </w:p>
+    <w:tbl>
+      <w:tblPr>
+        <w:tblStyle w:val="TableGrid"/>
+        <w:tblW w:w="0" w:type="auto"/>
+        <w:tblLayout w:type="fixed"/>
+        <w:tblLook w:val="04A0" w:firstRow="1" w:lastRow="0" w:firstColumn="0" w:lastColumn="0" w:noHBand="0" w:noVBand="1"/>
+      </w:tblPr>
+      <w:tblGrid>
+        <w:gridCol w:w="2293"/>
+        <w:gridCol w:w="1704"/>
+        <w:gridCol w:w="2325"/>
+        <w:gridCol w:w="1265"/>
+        <w:gridCol w:w="1772"/>
+      </w:tblGrid>
+      <w:tr>
+        <w:trPr>
+          <w:tblHeader/>
+        </w:trPr>
+        <w:tc>
+          <w:tcPr>
+            <w:tcW w:w="2293" w:type="dxa"/>
+            <w:shd w:val="clear" w:color="auto" w:fill="F2F2F2"/>
+          </w:tcPr>
+          <w:p>
+            <w:pPr/>
+            <w:r>
+              <w:t xml:space="preserve">Month</w:t>
+            </w:r>
+          </w:p>
+        </w:tc>
+        <w:tc>
+          <w:tcPr>
+            <w:tcW w:w="1704" w:type="dxa"/>
+            <w:shd w:val="clear" w:color="auto" w:fill="F2F2F2"/>
+          </w:tcPr>
+          <w:p>
+            <w:pPr/>
+            <w:r>
+              <w:t xml:space="preserve">Abandoned Checkout v3</w:t>
+            </w:r>
+          </w:p>
+        </w:tc>
+        <w:tc>
+          <w:tcPr>
+            <w:tcW w:w="2325" w:type="dxa"/>
+            <w:shd w:val="clear" w:color="auto" w:fill="F2F2F2"/>
+          </w:tcPr>
+          <w:p>
+            <w:pPr/>
+            <w:r>
+              <w:t xml:space="preserve">Other core campaigns</w:t>
+            </w:r>
+          </w:p>
+        </w:tc>
+        <w:tc>
+          <w:tcPr>
+            <w:tcW w:w="1265" w:type="dxa"/>
+            <w:shd w:val="clear" w:color="auto" w:fill="F2F2F2"/>
+          </w:tcPr>
+          <w:p>
+            <w:pPr/>
+            <w:r>
+              <w:t xml:space="preserve">Core total</w:t>
+            </w:r>
+          </w:p>
+        </w:tc>
+        <w:tc>
+          <w:tcPr>
+            <w:tcW w:w="1772" w:type="dxa"/>
+            <w:shd w:val="clear" w:color="auto" w:fill="F2F2F2"/>
+          </w:tcPr>
+          <w:p>
+            <w:pPr/>
+            <w:r>
+              <w:t xml:space="preserve">Promos (not core)</w:t>
+            </w:r>
+          </w:p>
+        </w:tc>
+      </w:tr>
+      <w:tr>
+        <w:tc>
+          <w:tcPr>
+            <w:tcW w:w="2293" w:type="dxa"/>
+          </w:tcPr>
+          <w:p>
+            <w:pPr/>
+            <w:r>
+              <w:t xml:space="preserve">Nov 2025</w:t>
+            </w:r>
+          </w:p>
+        </w:tc>
+        <w:tc>
+          <w:tcPr>
+            <w:tcW w:w="1704" w:type="dxa"/>
+          </w:tcPr>
+          <w:p>
+            <w:pPr/>
+            <w:r>
+              <w:t xml:space="preserve">—</w:t>
+            </w:r>
+          </w:p>
+        </w:tc>
+        <w:tc>
+          <w:tcPr>
+            <w:tcW w:w="2325" w:type="dxa"/>
+          </w:tcPr>
+          <w:p>
+            <w:pPr/>
+            <w:r>
+              <w:t xml:space="preserve">14,380</w:t>
+            </w:r>
+          </w:p>
+        </w:tc>
+        <w:tc>
+          <w:tcPr>
+            <w:tcW w:w="1265" w:type="dxa"/>
+          </w:tcPr>
+          <w:p>
+            <w:pPr/>
+            <w:r>
+              <w:t xml:space="preserve">14,380</w:t>
+            </w:r>
+          </w:p>
+        </w:tc>
+        <w:tc>
+          <w:tcPr>
+            <w:tcW w:w="1772" w:type="dxa"/>
+          </w:tcPr>
+          <w:p>
+            <w:pPr/>
+            <w:r>
+              <w:t xml:space="preserve">78,518</w:t>
+            </w:r>
+          </w:p>
+        </w:tc>
+      </w:tr>
+      <w:tr>
+        <w:tc>
+          <w:tcPr>
+            <w:tcW w:w="2293" w:type="dxa"/>
+          </w:tcPr>
+          <w:p>
+            <w:pPr/>
+            <w:r>
+              <w:t xml:space="preserve">Dec 2025</w:t>
+            </w:r>
+          </w:p>
+        </w:tc>
+        <w:tc>
+          <w:tcPr>
+            <w:tcW w:w="1704" w:type="dxa"/>
+          </w:tcPr>
+          <w:p>
+            <w:pPr/>
+            <w:r>
+              <w:t xml:space="preserve">—</w:t>
+            </w:r>
+          </w:p>
+        </w:tc>
+        <w:tc>
+          <w:tcPr>
+            <w:tcW w:w="2325" w:type="dxa"/>
+          </w:tcPr>
+          <w:p>
+            <w:pPr/>
+            <w:r>
+              <w:t xml:space="preserve">12,516</w:t>
+            </w:r>
+          </w:p>
+        </w:tc>
+        <w:tc>
+          <w:tcPr>
+            <w:tcW w:w="1265" w:type="dxa"/>
+          </w:tcPr>
+          <w:p>
+            <w:pPr/>
+            <w:r>
+              <w:t xml:space="preserve">12,516</w:t>
+            </w:r>
+          </w:p>
+        </w:tc>
+        <w:tc>
+          <w:tcPr>
+            <w:tcW w:w="1772" w:type="dxa"/>
+          </w:tcPr>
+          <w:p>
+            <w:pPr/>
+            <w:r>
+              <w:t xml:space="preserve">11</w:t>
+            </w:r>
+          </w:p>
+        </w:tc>
+      </w:tr>
+      <w:tr>
+        <w:tc>
+          <w:tcPr>
+            <w:tcW w:w="2293" w:type="dxa"/>
+          </w:tcPr>
+          <w:p>
+            <w:pPr/>
+            <w:r>
+              <w:t xml:space="preserve">Jan 2026</w:t>
+            </w:r>
+          </w:p>
+        </w:tc>
+        <w:tc>
+          <w:tcPr>
+            <w:tcW w:w="1704" w:type="dxa"/>
+          </w:tcPr>
+          <w:p>
+            <w:pPr/>
+            <w:r>
+              <w:t xml:space="preserve">—</w:t>
+            </w:r>
+          </w:p>
+        </w:tc>
+        <w:tc>
+          <w:tcPr>
+            <w:tcW w:w="2325" w:type="dxa"/>
+          </w:tcPr>
+          <w:p>
+            <w:pPr/>
+            <w:r>
+              <w:t xml:space="preserve">18,022</w:t>
+            </w:r>
+          </w:p>
+        </w:tc>
+        <w:tc>
+          <w:tcPr>
+            <w:tcW w:w="1265" w:type="dxa"/>
+          </w:tcPr>
+          <w:p>
+            <w:pPr/>
+            <w:r>
+              <w:t xml:space="preserve">18,022</w:t>
+            </w:r>
+          </w:p>
+        </w:tc>
+        <w:tc>
+          <w:tcPr>
+            <w:tcW w:w="1772" w:type="dxa"/>
+          </w:tcPr>
+          <w:p>
+            <w:pPr/>
+            <w:r>
+              <w:t xml:space="preserve">747</w:t>
+            </w:r>
+          </w:p>
+        </w:tc>
+      </w:tr>
+      <w:tr>
+        <w:tc>
+          <w:tcPr>
+            <w:tcW w:w="2293" w:type="dxa"/>
+          </w:tcPr>
+          <w:p>
+            <w:pPr/>
+            <w:r>
+              <w:t xml:space="preserve">Feb 2026</w:t>
+            </w:r>
+          </w:p>
+        </w:tc>
+        <w:tc>
+          <w:tcPr>
+            <w:tcW w:w="1704" w:type="dxa"/>
+          </w:tcPr>
+          <w:p>
+            <w:pPr/>
+            <w:r>
+              <w:t xml:space="preserve">—</w:t>
+            </w:r>
+          </w:p>
+        </w:tc>
+        <w:tc>
+          <w:tcPr>
+            <w:tcW w:w="2325" w:type="dxa"/>
+          </w:tcPr>
+          <w:p>
+            <w:pPr/>
+            <w:r>
+              <w:t xml:space="preserve">16,847</w:t>
+            </w:r>
+          </w:p>
+        </w:tc>
+        <w:tc>
+          <w:tcPr>
+            <w:tcW w:w="1265" w:type="dxa"/>
+          </w:tcPr>
+          <w:p>
+            <w:pPr/>
+            <w:r>
+              <w:t xml:space="preserve">16,847</w:t>
+            </w:r>
+          </w:p>
+        </w:tc>
+        <w:tc>
+          <w:tcPr>
+            <w:tcW w:w="1772" w:type="dxa"/>
+          </w:tcPr>
+          <w:p>
+            <w:pPr/>
+            <w:r>
+              <w:t xml:space="preserve">288</w:t>
+            </w:r>
+          </w:p>
+        </w:tc>
+      </w:tr>
+      <w:tr>
+        <w:tc>
+          <w:tcPr>
+            <w:tcW w:w="2293" w:type="dxa"/>
+          </w:tcPr>
+          <w:p>
+            <w:pPr/>
+            <w:r>
+              <w:t xml:space="preserve">Mar 2026</w:t>
+            </w:r>
+          </w:p>
+        </w:tc>
+        <w:tc>
+          <w:tcPr>
+            <w:tcW w:w="1704" w:type="dxa"/>
+          </w:tcPr>
+          <w:p>
+            <w:pPr/>
+            <w:r>
+              <w:t xml:space="preserve">—</w:t>
+            </w:r>
+          </w:p>
+        </w:tc>
+        <w:tc>
+          <w:tcPr>
+            <w:tcW w:w="2325" w:type="dxa"/>
+          </w:tcPr>
+          <w:p>
+            <w:pPr/>
+            <w:r>
+              <w:t xml:space="preserve">28,365</w:t>
+            </w:r>
+          </w:p>
+        </w:tc>
+        <w:tc>
+          <w:tcPr>
+            <w:tcW w:w="1265" w:type="dxa"/>
+          </w:tcPr>
+          <w:p>
+            <w:pPr/>
+            <w:r>
+              <w:t xml:space="preserve">28,365</w:t>
+            </w:r>
+          </w:p>
+        </w:tc>
+        <w:tc>
+          <w:tcPr>
+            <w:tcW w:w="1772" w:type="dxa"/>
+          </w:tcPr>
+          <w:p>
+            <w:pPr/>
+            <w:r>
+              <w:t xml:space="preserve">0</w:t>
+            </w:r>
+          </w:p>
+        </w:tc>
+      </w:tr>
+      <w:tr>
+        <w:tc>
+          <w:tcPr>
+            <w:tcW w:w="2293" w:type="dxa"/>
+          </w:tcPr>
+          <w:p>
+            <w:pPr/>
+            <w:r>
+              <w:t xml:space="preserve">Apr 2026</w:t>
+            </w:r>
+          </w:p>
+        </w:tc>
+        <w:tc>
+          <w:tcPr>
+            <w:tcW w:w="1704" w:type="dxa"/>
+          </w:tcPr>
+          <w:p>
+            <w:pPr/>
+            <w:r>
+              <w:t xml:space="preserve">—</w:t>
+            </w:r>
+          </w:p>
+        </w:tc>
+        <w:tc>
+          <w:tcPr>
+            <w:tcW w:w="2325" w:type="dxa"/>
+          </w:tcPr>
+          <w:p>
+            <w:pPr/>
+            <w:r>
+              <w:t xml:space="preserve">24,798</w:t>
+            </w:r>
+          </w:p>
+        </w:tc>
+        <w:tc>
+          <w:tcPr>
+            <w:tcW w:w="1265" w:type="dxa"/>
+          </w:tcPr>
+          <w:p>
+            <w:pPr/>
+            <w:r>
+              <w:t xml:space="preserve">24,798</w:t>
+            </w:r>
+          </w:p>
+        </w:tc>
+        <w:tc>
+          <w:tcPr>
+            <w:tcW w:w="1772" w:type="dxa"/>
+          </w:tcPr>
+          <w:p>
+            <w:pPr/>
+            <w:r>
+              <w:t xml:space="preserve">0</w:t>
+            </w:r>
+          </w:p>
+        </w:tc>
+      </w:tr>
+      <w:tr>
+        <w:tc>
+          <w:tcPr>
+            <w:tcW w:w="2293" w:type="dxa"/>
+          </w:tcPr>
+          <w:p>
+            <w:pPr/>
+            <w:r>
+              <w:t xml:space="preserve">May 2026</w:t>
+            </w:r>
+          </w:p>
+        </w:tc>
+        <w:tc>
+          <w:tcPr>
+            <w:tcW w:w="1704" w:type="dxa"/>
+          </w:tcPr>
+          <w:p>
+            <w:pPr/>
+            <w:r>
+              <w:t xml:space="preserve">—</w:t>
+            </w:r>
+          </w:p>
+        </w:tc>
+        <w:tc>
+          <w:tcPr>
+            <w:tcW w:w="2325" w:type="dxa"/>
+          </w:tcPr>
+          <w:p>
+            <w:pPr/>
+            <w:r>
+              <w:t xml:space="preserve">27,822</w:t>
+            </w:r>
+          </w:p>
+        </w:tc>
+        <w:tc>
+          <w:tcPr>
+            <w:tcW w:w="1265" w:type="dxa"/>
+          </w:tcPr>
+          <w:p>
+            <w:pPr/>
+            <w:r>
+              <w:t xml:space="preserve">27,822</w:t>
+            </w:r>
+          </w:p>
+        </w:tc>
+        <w:tc>
+          <w:tcPr>
+            <w:tcW w:w="1772" w:type="dxa"/>
+          </w:tcPr>
+          <w:p>
+            <w:pPr/>
+            <w:r>
+              <w:t xml:space="preserve">0</w:t>
+            </w:r>
+          </w:p>
+        </w:tc>
+      </w:tr>
+      <w:tr>
+        <w:tc>
+          <w:tcPr>
+            <w:tcW w:w="2293" w:type="dxa"/>
+          </w:tcPr>
+          <w:p>
+            <w:pPr/>
+            <w:r>
+              <w:t xml:space="preserve">Jun 2026</w:t>
+            </w:r>
+          </w:p>
+        </w:tc>
+        <w:tc>
+          <w:tcPr>
+            <w:tcW w:w="1704" w:type="dxa"/>
+          </w:tcPr>
+          <w:p>
+            <w:pPr/>
+            <w:r>
+              <w:t xml:space="preserve">—</w:t>
+            </w:r>
+          </w:p>
+        </w:tc>
+        <w:tc>
+          <w:tcPr>
+            <w:tcW w:w="2325" w:type="dxa"/>
+          </w:tcPr>
+          <w:p>
+            <w:pPr/>
+            <w:r>
+              <w:t xml:space="preserve">31,235</w:t>
+            </w:r>
+          </w:p>
+        </w:tc>
+        <w:tc>
+          <w:tcPr>
+            <w:tcW w:w="1265" w:type="dxa"/>
+          </w:tcPr>
+          <w:p>
+            <w:pPr/>
+            <w:r>
+              <w:t xml:space="preserve">31,235</w:t>
+            </w:r>
+          </w:p>
+        </w:tc>
+        <w:tc>
+          <w:tcPr>
+            <w:tcW w:w="1772" w:type="dxa"/>
+          </w:tcPr>
+          <w:p>
+            <w:pPr/>
+            <w:r>
+              <w:t xml:space="preserve">20,658</w:t>
+            </w:r>
+          </w:p>
+        </w:tc>
+      </w:tr>
+      <w:tr>
+        <w:tc>
+          <w:tcPr>
+            <w:tcW w:w="2293" w:type="dxa"/>
+          </w:tcPr>
+          <w:p>
+            <w:pPr/>
+            <w:r>
+              <w:t xml:space="preserve">Jul 2026</w:t>
+            </w:r>
+          </w:p>
+        </w:tc>
+        <w:tc>
+          <w:tcPr>
+            <w:tcW w:w="1704" w:type="dxa"/>
+          </w:tcPr>
+          <w:p>
+            <w:pPr/>
+            <w:r>
+              <w:t xml:space="preserve">14,655</w:t>
+            </w:r>
+          </w:p>
+        </w:tc>
+        <w:tc>
+          <w:tcPr>
+            <w:tcW w:w="2325" w:type="dxa"/>
+          </w:tcPr>
+          <w:p>
+            <w:pPr/>
+            <w:r>
+              <w:t xml:space="preserve">34,580</w:t>
+            </w:r>
+          </w:p>
+        </w:tc>
+        <w:tc>
+          <w:tcPr>
+            <w:tcW w:w="1265" w:type="dxa"/>
+          </w:tcPr>
+          <w:p>
+            <w:pPr/>
+            <w:r>
+              <w:t xml:space="preserve">49,235</w:t>
+            </w:r>
+          </w:p>
+        </w:tc>
+        <w:tc>
+          <w:tcPr>
+            <w:tcW w:w="1772" w:type="dxa"/>
+          </w:tcPr>
+          <w:p>
+            <w:pPr/>
+            <w:r>
+              <w:t xml:space="preserve">39,225</w:t>
+            </w:r>
+          </w:p>
+        </w:tc>
+      </w:tr>
+      <w:tr>
+        <w:tc>
+          <w:tcPr>
+            <w:tcW w:w="2293" w:type="dxa"/>
+          </w:tcPr>
+          <w:p>
+            <w:pPr/>
+            <w:r>
+              <w:t xml:space="preserve">Aug 2026</w:t>
+            </w:r>
+          </w:p>
+        </w:tc>
+        <w:tc>
+          <w:tcPr>
+            <w:tcW w:w="1704" w:type="dxa"/>
+          </w:tcPr>
+          <w:p>
+            <w:pPr/>
+            <w:r>
+              <w:t xml:space="preserve">50,565</w:t>
+            </w:r>
+          </w:p>
+        </w:tc>
+        <w:tc>
+          <w:tcPr>
+            <w:tcW w:w="2325" w:type="dxa"/>
+          </w:tcPr>
+          <w:p>
+            <w:pPr/>
+            <w:r>
+              <w:t xml:space="preserve">5,739</w:t>
+            </w:r>
+          </w:p>
+        </w:tc>
+        <w:tc>
+          <w:tcPr>
+            <w:tcW w:w="1265" w:type="dxa"/>
+          </w:tcPr>
+          <w:p>
+            <w:pPr/>
+            <w:r>
+              <w:t xml:space="preserve">56,304</w:t>
+            </w:r>
+          </w:p>
+        </w:tc>
+        <w:tc>
+          <w:tcPr>
+            <w:tcW w:w="1772" w:type="dxa"/>
+          </w:tcPr>
+          <w:p>
+            <w:pPr/>
+            <w:r>
+              <w:t xml:space="preserve">516,225</w:t>
+            </w:r>
+          </w:p>
+        </w:tc>
+      </w:tr>
+      <w:tr>
+        <w:tc>
+          <w:tcPr>
+            <w:tcW w:w="2293" w:type="dxa"/>
+          </w:tcPr>
+          <w:p>
+            <w:pPr/>
+            <w:r>
+              <w:t xml:space="preserve">Sep 2026</w:t>
+            </w:r>
+          </w:p>
+        </w:tc>
+        <w:tc>
+          <w:tcPr>
+            <w:tcW w:w="1704" w:type="dxa"/>
+          </w:tcPr>
+          <w:p>
+            <w:pPr/>
+            <w:r>
+              <w:t xml:space="preserve">66,721</w:t>
+            </w:r>
+          </w:p>
+        </w:tc>
+        <w:tc>
+          <w:tcPr>
+            <w:tcW w:w="2325" w:type="dxa"/>
+          </w:tcPr>
+          <w:p>
+            <w:pPr/>
+            <w:r>
+              <w:t xml:space="preserve">1,701</w:t>
+            </w:r>
+          </w:p>
+        </w:tc>
+        <w:tc>
+          <w:tcPr>
+            <w:tcW w:w="1265" w:type="dxa"/>
+          </w:tcPr>
+          <w:p>
+            <w:pPr/>
+            <w:r>
+              <w:t xml:space="preserve">68,422</w:t>
+            </w:r>
+          </w:p>
+        </w:tc>
+        <w:tc>
+          <w:tcPr>
+            <w:tcW w:w="1772" w:type="dxa"/>
+          </w:tcPr>
+          <w:p>
+            <w:pPr/>
+            <w:r>
+              <w:t xml:space="preserve">223,638</w:t>
+            </w:r>
+          </w:p>
+        </w:tc>
+      </w:tr>
+      <w:tr>
+        <w:tc>
+          <w:tcPr>
+            <w:tcW w:w="2293" w:type="dxa"/>
+          </w:tcPr>
+          <w:p>
+            <w:pPr/>
+            <w:r>
+              <w:t xml:space="preserve">Oct 2026 (Oct 1–29)</w:t>
+            </w:r>
+          </w:p>
+        </w:tc>
+        <w:tc>
+          <w:tcPr>
+            <w:tcW w:w="1704" w:type="dxa"/>
+          </w:tcPr>
+          <w:p>
+            <w:pPr/>
+            <w:r>
+              <w:t xml:space="preserve">72,268</w:t>
+            </w:r>
+          </w:p>
+        </w:tc>
+        <w:tc>
+          <w:tcPr>
+            <w:tcW w:w="2325" w:type="dxa"/>
+          </w:tcPr>
+          <w:p>
+            <w:pPr/>
+            <w:r>
+              <w:t xml:space="preserve">4,332</w:t>
+            </w:r>
+          </w:p>
+        </w:tc>
+        <w:tc>
+          <w:tcPr>
+            <w:tcW w:w="1265" w:type="dxa"/>
+          </w:tcPr>
+          <w:p>
+            <w:pPr/>
+            <w:r>
+              <w:t xml:space="preserve">76,600</w:t>
+            </w:r>
+          </w:p>
+        </w:tc>
+        <w:tc>
+          <w:tcPr>
+            <w:tcW w:w="1772" w:type="dxa"/>
+          </w:tcPr>
+          <w:p>
+            <w:pPr/>
+            <w:r>
+              <w:t xml:space="preserve">291</w:t>
+            </w:r>
+          </w:p>
+        </w:tc>
+      </w:tr>
+      <w:tr>
+        <w:tc>
+          <w:tcPr>
+            <w:tcW w:w="2293" w:type="dxa"/>
+          </w:tcPr>
+          <w:p>
+            <w:pPr/>
+            <w:r>
+              <w:rPr>
+                <w:b/>
+              </w:rPr>
+              <w:t xml:space="preserve">Total</w:t>
+            </w:r>
+          </w:p>
+        </w:tc>
+        <w:tc>
+          <w:tcPr>
+            <w:tcW w:w="1704" w:type="dxa"/>
+          </w:tcPr>
+          <w:p>
+            <w:pPr/>
+            <w:r>
+              <w:rPr>
+                <w:b/>
+              </w:rPr>
+              <w:t xml:space="preserve">204,209</w:t>
+            </w:r>
+          </w:p>
+        </w:tc>
+        <w:tc>
+          <w:tcPr>
+            <w:tcW w:w="2325" w:type="dxa"/>
+          </w:tcPr>
+          <w:p>
+            <w:pPr/>
+            <w:r>
+              <w:rPr>
+                <w:b/>
+              </w:rPr>
+              <w:t xml:space="preserve">220,337</w:t>
+            </w:r>
+          </w:p>
+        </w:tc>
+        <w:tc>
+          <w:tcPr>
+            <w:tcW w:w="1265" w:type="dxa"/>
+          </w:tcPr>
+          <w:p>
+            <w:pPr/>
+            <w:r>
+              <w:rPr>
+                <w:b/>
+              </w:rPr>
+              <w:t xml:space="preserve">424,546</w:t>
+            </w:r>
+          </w:p>
+        </w:tc>
+        <w:tc>
+          <w:tcPr>
+            <w:tcW w:w="1772" w:type="dxa"/>
+          </w:tcPr>
+          <w:p>
+            <w:pPr/>
+            <w:r>
+              <w:rPr>
+                <w:b/>
+              </w:rPr>
+              <w:t xml:space="preserve">879,601</w:t>
+            </w:r>
+          </w:p>
+        </w:tc>
+      </w:tr>
+    </w:tbl>
+    <w:p>
+      <w:pPr/>
+      <w:r>
+        <w:t xml:space="preserve">"Other core campaigns" includes the earlier abandoned checkout versions: Abandoned checkout campaign (v1) until Dec 2025 and Abandoned checkout campaign v2 from Dec 2025 to Aug 2026. Both are now archived. It also includes Failed Charge, Onboarding — Dog, Onboarding — Cat, Card Validation, Testimonial and Abandoned Checkout — All Products (dynamic). Small amounts in the Promos column for Dec, Jan, Feb and Oct are late sends from earlier promos.</w:t>
+      </w:r>
+    </w:p>
+    <w:p>
+      <w:pPr/>
+      <w:r>
+        <w:t xml:space="preserve">To check a month in Customer.io, open the campaign, set the date range to that month, choose SMS, and read Sent.</w:t>
+      </w:r>
+    </w:p>
     <w:p>
       <w:pPr>
         <w:pStyle w:val="Heading2"/>

</xml_diff>